<commit_message>
Update S09 T6: reframe category coverage as concept-dependent
Replace fixed-list framing with a working framework approach.
Remove minimum/maximum language. Add Hot, Frozen, and Low ABV
as extended categories. Frame all omissions as deliberate decisions.
Update REFLECT Q11 and TM discussion prompt accordingly.

https://claude.ai/code/session_01F5fTWJV2bPcyXoGvn5n7gq
</commit_message>
<xml_diff>
--- a/BarSkills_S09_SB.docx
+++ b/BarSkills_S09_SB.docx
@@ -3276,7 +3276,7 @@
           <w:i w:val="0"/>
           <w:sz w:val="20"/>
         </w:rPr>
-        <w:t>A well-built cocktail menu covers all major drinking occasions. If a category is missing, the bar loses an order every time a guest at that table wants that style of drink. This is not about variety for its own sake — it is about not losing a sale.</w:t>
+        <w:t>A well-built cocktail menu covers the drinking occasions that are relevant to its concept. The categories below are a working framework — the bar concept determines which apply, which to combine, and whether additional categories belong. A beach bar needs Frozen. A supper club needs Hot cocktails. A wine-forward venue may not need Spirit-Forward at all. The framework is the starting point. The concept is the edit.</w:t>
       </w:r>
     </w:p>
     <w:tbl>
@@ -3596,6 +3596,135 @@
           </w:p>
         </w:tc>
       </w:tr>
+      <w:tr>
+        <w:tc>
+          <w:tcPr>
+            <w:tcW w:type="dxa" w:w="3120"/>
+            <w:shd w:val="clear" w:color="auto" w:fill="EBF0F7"/>
+          </w:tcPr>
+          <w:p>
+            <w:r>
+              <w:rPr>
+                <w:sz w:val="18"/>
+              </w:rPr>
+              <w:t>Hot / Specialty Coffee</w:t>
+            </w:r>
+          </w:p>
+        </w:tc>
+        <w:tc>
+          <w:tcPr>
+            <w:tcW w:type="dxa" w:w="3120"/>
+            <w:shd w:val="clear" w:color="auto" w:fill="EBF0F7"/>
+          </w:tcPr>
+          <w:p>
+            <w:r>
+              <w:rPr>
+                <w:sz w:val="18"/>
+              </w:rPr>
+              <w:t>Irish Coffee, Spanish Coffee, Spiced Mocha</w:t>
+            </w:r>
+          </w:p>
+        </w:tc>
+        <w:tc>
+          <w:tcPr>
+            <w:tcW w:type="dxa" w:w="3120"/>
+            <w:shd w:val="clear" w:color="auto" w:fill="EBF0F7"/>
+          </w:tcPr>
+          <w:p>
+            <w:r>
+              <w:rPr>
+                <w:sz w:val="18"/>
+              </w:rPr>
+              <w:t>Evening, cold weather, after dinner</w:t>
+            </w:r>
+          </w:p>
+        </w:tc>
+      </w:tr>
+      <w:tr>
+        <w:tc>
+          <w:tcPr>
+            <w:tcW w:type="dxa" w:w="3120"/>
+          </w:tcPr>
+          <w:p>
+            <w:r>
+              <w:rPr>
+                <w:sz w:val="18"/>
+              </w:rPr>
+              <w:t>Frozen / Blended</w:t>
+            </w:r>
+          </w:p>
+        </w:tc>
+        <w:tc>
+          <w:tcPr>
+            <w:tcW w:type="dxa" w:w="3120"/>
+          </w:tcPr>
+          <w:p>
+            <w:r>
+              <w:rPr>
+                <w:sz w:val="18"/>
+              </w:rPr>
+              <w:t>Frozen Margarita, Piña Colada</w:t>
+            </w:r>
+          </w:p>
+        </w:tc>
+        <w:tc>
+          <w:tcPr>
+            <w:tcW w:type="dxa" w:w="3120"/>
+          </w:tcPr>
+          <w:p>
+            <w:r>
+              <w:rPr>
+                <w:sz w:val="18"/>
+              </w:rPr>
+              <w:t>Resort, beach, high-volume warm-weather venues</w:t>
+            </w:r>
+          </w:p>
+        </w:tc>
+      </w:tr>
+      <w:tr>
+        <w:tc>
+          <w:tcPr>
+            <w:tcW w:type="dxa" w:w="3120"/>
+            <w:shd w:val="clear" w:color="auto" w:fill="EBF0F7"/>
+          </w:tcPr>
+          <w:p>
+            <w:r>
+              <w:rPr>
+                <w:sz w:val="18"/>
+              </w:rPr>
+              <w:t>Low ABV / Session</w:t>
+            </w:r>
+          </w:p>
+        </w:tc>
+        <w:tc>
+          <w:tcPr>
+            <w:tcW w:type="dxa" w:w="3120"/>
+            <w:shd w:val="clear" w:color="auto" w:fill="EBF0F7"/>
+          </w:tcPr>
+          <w:p>
+            <w:r>
+              <w:rPr>
+                <w:sz w:val="18"/>
+              </w:rPr>
+              <w:t>Aperitivo Spritz, Beer cocktail, Wine Spritz</w:t>
+            </w:r>
+          </w:p>
+        </w:tc>
+        <w:tc>
+          <w:tcPr>
+            <w:tcW w:type="dxa" w:w="3120"/>
+            <w:shd w:val="clear" w:color="auto" w:fill="EBF0F7"/>
+          </w:tcPr>
+          <w:p>
+            <w:r>
+              <w:rPr>
+                <w:sz w:val="18"/>
+              </w:rPr>
+              <w:t>Guests drinking across a long evening</w:t>
+            </w:r>
+          </w:p>
+        </w:tc>
+      </w:tr>
     </w:tbl>
     <w:p>
       <w:pPr>
@@ -3612,7 +3741,7 @@
           <w:i w:val="0"/>
           <w:sz w:val="20"/>
         </w:rPr>
-        <w:t>A menu missing the zero-proof category loses every table with one non-drinking guest. A menu without a spirit-forward option loses the guest who wants something serious. Missing sweet or sparkling loses the after-dinner and celebration orders. Category coverage is not about pleasing everyone — it is about not writing off an entire type of sale.</w:t>
+        <w:t>Not every concept needs every category. A category missing from a menu should be a deliberate decision — not an oversight. When a guest at a table cannot find the style of drink they want, that table's total spend drops. Knowing which categories your concept requires, and why, is part of the design work.</w:t>
       </w:r>
     </w:p>
     <w:p>
@@ -4013,7 +4142,7 @@
         <w:rPr>
           <w:sz w:val="20"/>
         </w:rPr>
-        <w:t>A cocktail menu has no zero-proof section and no sparkling category. Name two guest types who leave without ordering and explain what this means for that table's total spend.</w:t>
+        <w:t>A craft cocktail bar has no zero-proof section and no sparkling category. Are these gaps a problem for this concept? Name the guest types affected and explain what it means for that table's total spend.</w:t>
       </w:r>
     </w:p>
     <w:p>

</xml_diff>

<commit_message>
S09: update LCBO spirit costs, new Cosmo recipe, adjusted pricing
- Vodka: $1.00→$1.22/oz (Smirnoff 1140ml $46.95 LCBO)
- Kahlúa: $0.80→$1.30/oz (750ml $32.95 LCBO)
- Triple Sec: $0.80→$1.10/oz (Meaghers 750ml LCBO)
- Cointreau: updated to $1.65/oz (750ml $41.95 LCBO)
- Classic Cosmo recipe: 1.5oz vodka, 0.5oz Triple Sec, 0.25oz
  simple syrup, 1oz lime juice, 1oz cranberry; garnish: lime twist
- Selling prices adjusted: Black Russian $14→$17, White Russian
  $15→$18; Cosmo stays $15 (Cannery reference), Elevated $19
- All pour costs recalculated: BR 22%, WR 22.2%, Classic Cosmo
  19.5%, Elevated 16.5%
- Elevated Cosmo: cost increase $0.42→$0.20, profit gain $3.58→$3.80
- Elevated Cosmo ingredients scaled to match Classic volumes (1oz
  lemon juice + 1oz white cranberry)
- TM instructor notes, eval tables, and answer key all updated

https://claude.ai/code/session_01F5fTWJV2bPcyXoGvn5n7gq
</commit_message>
<xml_diff>
--- a/BarSkills_S09_SB.docx
+++ b/BarSkills_S09_SB.docx
@@ -715,7 +715,7 @@
           <w:i w:val="0"/>
           <w:sz w:val="20"/>
         </w:rPr>
-        <w:t>Example: Classic Cosmopolitan ingredients cost $2.10. Selling price $15. Pour cost = (2.10 ÷ 15) × 100 = 14%. This is within target — and leaves room to improve margin with strategic modifications, which you will see in Build 04.</w:t>
+        <w:t>Example: Classic Cosmopolitan (updated recipe with LCBO pricing). Ingredients cost $2.93. Selling price $15. Pour cost = (2.93 ÷ 15) × 100 = 19.5%. This is within target — and confirms that deliberate modifications can improve both the guest experience and the margin, as you will see in Build 04.</w:t>
       </w:r>
     </w:p>
     <w:p>
@@ -1182,7 +1182,7 @@
         <w:rPr>
           <w:sz w:val="20"/>
         </w:rPr>
-        <w:t>A cocktail costs $2.80 in ingredients and sells for $16. Calculate the pour cost percentage. Is it within target?</w:t>
+        <w:t>A cocktail costs $3.74 in ingredients and sells for $17. Calculate the pour cost percentage. Is it within target?</w:t>
       </w:r>
     </w:p>
     <w:p>
@@ -4528,7 +4528,7 @@
               <w:rPr>
                 <w:sz w:val="18"/>
               </w:rPr>
-              <w:t>$1.00/oz</w:t>
+              <w:t>$1.22/oz (LCBO)</w:t>
             </w:r>
           </w:p>
         </w:tc>
@@ -4542,7 +4542,7 @@
               <w:rPr>
                 <w:sz w:val="18"/>
               </w:rPr>
-              <w:t>$2.00</w:t>
+              <w:t>$2.44</w:t>
             </w:r>
           </w:p>
         </w:tc>
@@ -4570,7 +4570,7 @@
               <w:rPr>
                 <w:sz w:val="18"/>
               </w:rPr>
-              <w:t>$0.80/oz</w:t>
+              <w:t>$1.30/oz (LCBO)</w:t>
             </w:r>
           </w:p>
         </w:tc>
@@ -4583,7 +4583,7 @@
               <w:rPr>
                 <w:sz w:val="18"/>
               </w:rPr>
-              <w:t>$0.80</w:t>
+              <w:t>$1.30</w:t>
             </w:r>
           </w:p>
         </w:tc>
@@ -4626,7 +4626,7 @@
               <w:rPr>
                 <w:sz w:val="18"/>
               </w:rPr>
-              <w:t>$2.80</w:t>
+              <w:t>$3.74</w:t>
             </w:r>
           </w:p>
         </w:tc>
@@ -4666,7 +4666,7 @@
               <w:rPr>
                 <w:sz w:val="18"/>
               </w:rPr>
-              <w:t>$14</w:t>
+              <w:t>$17</w:t>
             </w:r>
           </w:p>
         </w:tc>
@@ -4696,7 +4696,7 @@
               <w:rPr>
                 <w:sz w:val="18"/>
               </w:rPr>
-              <w:t>(2.80 ÷ 14) × 100</w:t>
+              <w:t>(3.74 ÷ 17) × 100</w:t>
             </w:r>
           </w:p>
         </w:tc>
@@ -4710,7 +4710,7 @@
               <w:rPr>
                 <w:sz w:val="18"/>
               </w:rPr>
-              <w:t>20%  ✓ On target</w:t>
+              <w:t>22%  ✓ At target</w:t>
             </w:r>
           </w:p>
         </w:tc>
@@ -5105,7 +5105,7 @@
               <w:rPr>
                 <w:sz w:val="18"/>
               </w:rPr>
-              <w:t>$2.80 (same as Build 01)</w:t>
+              <w:t>$3.74 (same as Build 01)</w:t>
             </w:r>
           </w:p>
         </w:tc>
@@ -5189,7 +5189,7 @@
               <w:rPr>
                 <w:sz w:val="18"/>
               </w:rPr>
-              <w:t>$3.05</w:t>
+              <w:t>$3.99</w:t>
             </w:r>
           </w:p>
         </w:tc>
@@ -5229,7 +5229,7 @@
               <w:rPr>
                 <w:sz w:val="18"/>
               </w:rPr>
-              <w:t>$15</w:t>
+              <w:t>$18</w:t>
             </w:r>
           </w:p>
         </w:tc>
@@ -5259,7 +5259,7 @@
               <w:rPr>
                 <w:sz w:val="18"/>
               </w:rPr>
-              <w:t>(3.05 ÷ 15) × 100</w:t>
+              <w:t>(3.99 ÷ 18) × 100</w:t>
             </w:r>
           </w:p>
         </w:tc>
@@ -5273,7 +5273,7 @@
               <w:rPr>
                 <w:sz w:val="18"/>
               </w:rPr>
-              <w:t>20.3%  ✓ On target</w:t>
+              <w:t>22.2%  ✓ At target</w:t>
             </w:r>
           </w:p>
         </w:tc>
@@ -5651,7 +5651,7 @@
               <w:rPr>
                 <w:sz w:val="18"/>
               </w:rPr>
-              <w:t>Cointreau preferred. Adjust price accordingly if used.</w:t>
+              <w:t>Meaghers or similar. Cointreau upgrade reserved for Build 04.</w:t>
             </w:r>
           </w:p>
         </w:tc>
@@ -5667,7 +5667,7 @@
               <w:rPr>
                 <w:sz w:val="18"/>
               </w:rPr>
-              <w:t>Fresh Lime Juice</w:t>
+              <w:t>Simple Syrup</w:t>
             </w:r>
           </w:p>
         </w:tc>
@@ -5681,7 +5681,7 @@
               <w:rPr>
                 <w:sz w:val="18"/>
               </w:rPr>
-              <w:t>0.5oz / 15ml</w:t>
+              <w:t>0.25oz / 7ml</w:t>
             </w:r>
           </w:p>
         </w:tc>
@@ -5695,7 +5695,7 @@
               <w:rPr>
                 <w:sz w:val="18"/>
               </w:rPr>
-              <w:t>Squeeze to order. Not bottled.</w:t>
+              <w:t>House-made or commercial. Balances the citrus.</w:t>
             </w:r>
           </w:p>
         </w:tc>
@@ -5710,6 +5710,48 @@
               <w:rPr>
                 <w:sz w:val="18"/>
               </w:rPr>
+              <w:t>Fresh Lime Juice</w:t>
+            </w:r>
+          </w:p>
+        </w:tc>
+        <w:tc>
+          <w:tcPr>
+            <w:tcW w:type="dxa" w:w="3120"/>
+          </w:tcPr>
+          <w:p>
+            <w:r>
+              <w:rPr>
+                <w:sz w:val="18"/>
+              </w:rPr>
+              <w:t>1oz / 30ml</w:t>
+            </w:r>
+          </w:p>
+        </w:tc>
+        <w:tc>
+          <w:tcPr>
+            <w:tcW w:type="dxa" w:w="3120"/>
+          </w:tcPr>
+          <w:p>
+            <w:r>
+              <w:rPr>
+                <w:sz w:val="18"/>
+              </w:rPr>
+              <w:t>Squeeze to order. Not bottled. Approximately one lime.</w:t>
+            </w:r>
+          </w:p>
+        </w:tc>
+      </w:tr>
+      <w:tr>
+        <w:tc>
+          <w:tcPr>
+            <w:tcW w:type="dxa" w:w="3120"/>
+            <w:shd w:val="clear" w:color="auto" w:fill="EBF0F7"/>
+          </w:tcPr>
+          <w:p>
+            <w:r>
+              <w:rPr>
+                <w:sz w:val="18"/>
+              </w:rPr>
               <w:t>Cranberry Juice</w:t>
             </w:r>
           </w:p>
@@ -5717,26 +5759,28 @@
         <w:tc>
           <w:tcPr>
             <w:tcW w:type="dxa" w:w="3120"/>
-          </w:tcPr>
-          <w:p>
-            <w:r>
-              <w:rPr>
-                <w:sz w:val="18"/>
-              </w:rPr>
-              <w:t>0.5oz / 15ml</w:t>
+            <w:shd w:val="clear" w:color="auto" w:fill="EBF0F7"/>
+          </w:tcPr>
+          <w:p>
+            <w:r>
+              <w:rPr>
+                <w:sz w:val="18"/>
+              </w:rPr>
+              <w:t>1oz / 30ml</w:t>
             </w:r>
           </w:p>
         </w:tc>
         <w:tc>
           <w:tcPr>
             <w:tcW w:type="dxa" w:w="3120"/>
-          </w:tcPr>
-          <w:p>
-            <w:r>
-              <w:rPr>
-                <w:sz w:val="18"/>
-              </w:rPr>
-              <w:t>Just enough for colour. Not a dominant flavour.</w:t>
+            <w:shd w:val="clear" w:color="auto" w:fill="EBF0F7"/>
+          </w:tcPr>
+          <w:p>
+            <w:r>
+              <w:rPr>
+                <w:sz w:val="18"/>
+              </w:rPr>
+              <w:t>For colour and flavour balance.</w:t>
             </w:r>
           </w:p>
         </w:tc>
@@ -5757,7 +5801,7 @@
           <w:i w:val="0"/>
           <w:sz w:val="20"/>
         </w:rPr>
-        <w:t>Glass: Chilled coupe  |  Ice: None (strained)  |  Method: Shake, double strain  |  Garnish: Expressed lemon twist</w:t>
+        <w:t>Glass: Chilled coupe  |  Ice: None (strained)  |  Method: Shake, double strain  |  Garnish: Fresh lime twist</w:t>
       </w:r>
     </w:p>
     <w:p>
@@ -5770,7 +5814,7 @@
           <w:i w:val="0"/>
           <w:sz w:val="20"/>
         </w:rPr>
-        <w:t>Build order: Add all ingredients to a shaker with ice. Shake hard for 12–15 seconds. Double-strain into a pre-chilled coupe. Express a lemon twist over the glass surface and place on the rim.</w:t>
+        <w:t>Build order: Add all ingredients to a shaker with ice. Shake hard for 12–15 seconds. Double-strain into a pre-chilled coupe. Express a lime twist over the glass surface and place on the rim.</w:t>
       </w:r>
     </w:p>
     <w:tbl>
@@ -5860,7 +5904,7 @@
               <w:rPr>
                 <w:sz w:val="18"/>
               </w:rPr>
-              <w:t>$1.00/oz</w:t>
+              <w:t>$1.22/oz (LCBO)</w:t>
             </w:r>
           </w:p>
         </w:tc>
@@ -5874,7 +5918,7 @@
               <w:rPr>
                 <w:sz w:val="18"/>
               </w:rPr>
-              <w:t>$1.50</w:t>
+              <w:t>$1.83</w:t>
             </w:r>
           </w:p>
         </w:tc>
@@ -5902,7 +5946,7 @@
               <w:rPr>
                 <w:sz w:val="18"/>
               </w:rPr>
-              <w:t>$0.80/oz</w:t>
+              <w:t>$1.10/oz (LCBO)</w:t>
             </w:r>
           </w:p>
         </w:tc>
@@ -5915,7 +5959,7 @@
               <w:rPr>
                 <w:sz w:val="18"/>
               </w:rPr>
-              <w:t>$0.40</w:t>
+              <w:t>$0.55</w:t>
             </w:r>
           </w:p>
         </w:tc>
@@ -5931,7 +5975,7 @@
               <w:rPr>
                 <w:sz w:val="18"/>
               </w:rPr>
-              <w:t>Fresh Lime Juice 0.5oz</w:t>
+              <w:t>Simple Syrup 0.25oz</w:t>
             </w:r>
           </w:p>
         </w:tc>
@@ -5959,7 +6003,7 @@
               <w:rPr>
                 <w:sz w:val="18"/>
               </w:rPr>
-              <w:t>$0.15</w:t>
+              <w:t>$0.05</w:t>
             </w:r>
           </w:p>
         </w:tc>
@@ -5974,7 +6018,7 @@
               <w:rPr>
                 <w:sz w:val="18"/>
               </w:rPr>
-              <w:t>Cranberry Juice 0.5oz</w:t>
+              <w:t>Fresh Lime Juice 1oz</w:t>
             </w:r>
           </w:p>
         </w:tc>
@@ -6000,7 +6044,7 @@
               <w:rPr>
                 <w:sz w:val="18"/>
               </w:rPr>
-              <w:t>$0.05</w:t>
+              <w:t>$0.40</w:t>
             </w:r>
           </w:p>
         </w:tc>
@@ -6016,7 +6060,7 @@
               <w:rPr>
                 <w:sz w:val="18"/>
               </w:rPr>
-              <w:t>Total ingredient cost</w:t>
+              <w:t>Cranberry Juice 1oz</w:t>
             </w:r>
           </w:p>
         </w:tc>
@@ -6030,6 +6074,7 @@
               <w:rPr>
                 <w:sz w:val="18"/>
               </w:rPr>
+              <w:t>est.</w:t>
             </w:r>
           </w:p>
         </w:tc>
@@ -6043,7 +6088,7 @@
               <w:rPr>
                 <w:sz w:val="18"/>
               </w:rPr>
-              <w:t>$2.10</w:t>
+              <w:t>$0.10</w:t>
             </w:r>
           </w:p>
         </w:tc>
@@ -6058,7 +6103,7 @@
               <w:rPr>
                 <w:sz w:val="18"/>
               </w:rPr>
-              <w:t>Selling price (Cannery)</w:t>
+              <w:t>Total ingredient cost</w:t>
             </w:r>
           </w:p>
         </w:tc>
@@ -6083,7 +6128,7 @@
               <w:rPr>
                 <w:sz w:val="18"/>
               </w:rPr>
-              <w:t>$15</w:t>
+              <w:t>$2.93</w:t>
             </w:r>
           </w:p>
         </w:tc>
@@ -6099,7 +6144,7 @@
               <w:rPr>
                 <w:sz w:val="18"/>
               </w:rPr>
-              <w:t>Pour cost %</w:t>
+              <w:t>Selling price (Cannery)</w:t>
             </w:r>
           </w:p>
         </w:tc>
@@ -6113,7 +6158,6 @@
               <w:rPr>
                 <w:sz w:val="18"/>
               </w:rPr>
-              <w:t>(2.10 ÷ 15) × 100</w:t>
             </w:r>
           </w:p>
         </w:tc>
@@ -6127,7 +6171,48 @@
               <w:rPr>
                 <w:sz w:val="18"/>
               </w:rPr>
-              <w:t>14%  — Well below target</w:t>
+              <w:t>$15</w:t>
+            </w:r>
+          </w:p>
+        </w:tc>
+      </w:tr>
+      <w:tr>
+        <w:tc>
+          <w:tcPr>
+            <w:tcW w:type="dxa" w:w="3120"/>
+          </w:tcPr>
+          <w:p>
+            <w:r>
+              <w:rPr>
+                <w:sz w:val="18"/>
+              </w:rPr>
+              <w:t>Pour cost %</w:t>
+            </w:r>
+          </w:p>
+        </w:tc>
+        <w:tc>
+          <w:tcPr>
+            <w:tcW w:type="dxa" w:w="3120"/>
+          </w:tcPr>
+          <w:p>
+            <w:r>
+              <w:rPr>
+                <w:sz w:val="18"/>
+              </w:rPr>
+              <w:t>(2.93 ÷ 15) × 100</w:t>
+            </w:r>
+          </w:p>
+        </w:tc>
+        <w:tc>
+          <w:tcPr>
+            <w:tcW w:type="dxa" w:w="3120"/>
+          </w:tcPr>
+          <w:p>
+            <w:r>
+              <w:rPr>
+                <w:sz w:val="18"/>
+              </w:rPr>
+              <w:t>19.5%  ✓ Within target</w:t>
             </w:r>
           </w:p>
         </w:tc>
@@ -6168,7 +6253,7 @@
               <w:rPr>
                 <w:sz w:val="20"/>
               </w:rPr>
-              <w:t>Pour cost 14% — excellent. But this drink is listed in the "Cannery Signature" section between generic classics with no visual callout and a generic ingredient-list description. High margin, low visibility = PUZZLE. The recipe is not the problem. The engineering around it is.</w:t>
+              <w:t>Pour cost 19.5% — within target. But this drink is listed in the "Cannery Signature" section between generic classics with no visual callout and a generic ingredient-list description. Good margin, low visibility = PUZZLE. The recipe is not the problem. The engineering around it is.</w:t>
             </w:r>
           </w:p>
         </w:tc>
@@ -6211,7 +6296,7 @@
           <w:i w:val="0"/>
           <w:sz w:val="20"/>
         </w:rPr>
-        <w:t>The same drink. Three modifications. A different menu position, a different description, and a selling price of $19. The ingredient cost increase is $0.42. The profit increase per drink is $3.58. This is why menus are designed — not assembled.</w:t>
+        <w:t>The same drink. Three modifications. A different menu position, a different description, and a selling price of $19. The ingredient cost increase is $0.20. The profit increase per drink is $3.80. This is why menus are designed — not assembled.</w:t>
       </w:r>
     </w:p>
     <w:p>
@@ -6341,7 +6426,7 @@
               <w:rPr>
                 <w:sz w:val="18"/>
               </w:rPr>
-              <w:t>Prepared 24–48h prior. Same base cost.</w:t>
+              <w:t>Prepared 24–48h prior. Same base cost as house vodka.</w:t>
             </w:r>
           </w:p>
         </w:tc>
@@ -6398,7 +6483,7 @@
               <w:rPr>
                 <w:sz w:val="18"/>
               </w:rPr>
-              <w:t>Fresh Lemon Juice</w:t>
+              <w:t>Simple Syrup</w:t>
             </w:r>
           </w:p>
         </w:tc>
@@ -6412,7 +6497,7 @@
               <w:rPr>
                 <w:sz w:val="18"/>
               </w:rPr>
-              <w:t>0.5oz / 15ml</w:t>
+              <w:t>0.25oz / 7ml</w:t>
             </w:r>
           </w:p>
         </w:tc>
@@ -6426,7 +6511,7 @@
               <w:rPr>
                 <w:sz w:val="18"/>
               </w:rPr>
-              <w:t>Squeezed from the infusion lemons. Byproduct — near zero cost.</w:t>
+              <w:t>Same as Classic.</w:t>
             </w:r>
           </w:p>
         </w:tc>
@@ -6441,7 +6526,7 @@
               <w:rPr>
                 <w:sz w:val="18"/>
               </w:rPr>
-              <w:t>White Cranberry Juice</w:t>
+              <w:t>Fresh Lemon Juice</w:t>
             </w:r>
           </w:p>
         </w:tc>
@@ -6454,7 +6539,7 @@
               <w:rPr>
                 <w:sz w:val="18"/>
               </w:rPr>
-              <w:t>0.5oz / 15ml</w:t>
+              <w:t>1oz / 30ml</w:t>
             </w:r>
           </w:p>
         </w:tc>
@@ -6467,7 +6552,7 @@
               <w:rPr>
                 <w:sz w:val="18"/>
               </w:rPr>
-              <w:t>Lighter colour. More refined visual than standard cranberry.</w:t>
+              <w:t>Squeezed from the infusion lemons. Byproduct — near zero cost.</w:t>
             </w:r>
           </w:p>
         </w:tc>
@@ -6483,7 +6568,7 @@
               <w:rPr>
                 <w:sz w:val="18"/>
               </w:rPr>
-              <w:t>Orange Bitters</w:t>
+              <w:t>White Cranberry Juice</w:t>
             </w:r>
           </w:p>
         </w:tc>
@@ -6497,7 +6582,7 @@
               <w:rPr>
                 <w:sz w:val="18"/>
               </w:rPr>
-              <w:t>2 dashes or spray</w:t>
+              <w:t>1oz / 30ml</w:t>
             </w:r>
           </w:p>
         </w:tc>
@@ -6511,7 +6596,7 @@
               <w:rPr>
                 <w:sz w:val="18"/>
               </w:rPr>
-              <w:t>Dash into shaker OR atomize 2 sprays inside the chilled coupe before straining.</w:t>
+              <w:t>Lighter colour. More refined visual than standard cranberry.</w:t>
             </w:r>
           </w:p>
         </w:tc>
@@ -6526,7 +6611,7 @@
               <w:rPr>
                 <w:sz w:val="18"/>
               </w:rPr>
-              <w:t>Dehydrated Citrus Wheel</w:t>
+              <w:t>Orange Bitters</w:t>
             </w:r>
           </w:p>
         </w:tc>
@@ -6539,7 +6624,7 @@
               <w:rPr>
                 <w:sz w:val="18"/>
               </w:rPr>
-              <w:t>1 piece</w:t>
+              <w:t>2 dashes or spray</w:t>
             </w:r>
           </w:p>
         </w:tc>
@@ -6552,7 +6637,7 @@
               <w:rPr>
                 <w:sz w:val="18"/>
               </w:rPr>
-              <w:t>Lime, lemon, or orange. Prepared in advance. Lasts weeks.</w:t>
+              <w:t>Dash into shaker OR atomize 2 sprays inside the chilled coupe before straining.</w:t>
             </w:r>
           </w:p>
         </w:tc>
@@ -6568,7 +6653,7 @@
               <w:rPr>
                 <w:sz w:val="18"/>
               </w:rPr>
-              <w:t>Expressed Orange Peel</w:t>
+              <w:t>Dehydrated Citrus Wheel</w:t>
             </w:r>
           </w:p>
         </w:tc>
@@ -6582,7 +6667,7 @@
               <w:rPr>
                 <w:sz w:val="18"/>
               </w:rPr>
-              <w:t>1 strip</w:t>
+              <w:t>1 piece</w:t>
             </w:r>
           </w:p>
         </w:tc>
@@ -6590,6 +6675,47 @@
           <w:tcPr>
             <w:tcW w:type="dxa" w:w="3120"/>
             <w:shd w:val="clear" w:color="auto" w:fill="EBF0F7"/>
+          </w:tcPr>
+          <w:p>
+            <w:r>
+              <w:rPr>
+                <w:sz w:val="18"/>
+              </w:rPr>
+              <w:t>Lime, lemon, or orange. Prepared in advance. Lasts weeks.</w:t>
+            </w:r>
+          </w:p>
+        </w:tc>
+      </w:tr>
+      <w:tr>
+        <w:tc>
+          <w:tcPr>
+            <w:tcW w:type="dxa" w:w="3120"/>
+          </w:tcPr>
+          <w:p>
+            <w:r>
+              <w:rPr>
+                <w:sz w:val="18"/>
+              </w:rPr>
+              <w:t>Expressed Orange Peel</w:t>
+            </w:r>
+          </w:p>
+        </w:tc>
+        <w:tc>
+          <w:tcPr>
+            <w:tcW w:type="dxa" w:w="3120"/>
+          </w:tcPr>
+          <w:p>
+            <w:r>
+              <w:rPr>
+                <w:sz w:val="18"/>
+              </w:rPr>
+              <w:t>1 strip</w:t>
+            </w:r>
+          </w:p>
+        </w:tc>
+        <w:tc>
+          <w:tcPr>
+            <w:tcW w:type="dxa" w:w="3120"/>
           </w:tcPr>
           <w:p>
             <w:r>
@@ -6838,7 +6964,7 @@
               <w:rPr>
                 <w:sz w:val="18"/>
               </w:rPr>
-              <w:t>$2.10</w:t>
+              <w:t>$2.93</w:t>
             </w:r>
           </w:p>
         </w:tc>
@@ -6866,7 +6992,7 @@
               <w:rPr>
                 <w:sz w:val="18"/>
               </w:rPr>
-              <w:t>14.0%</w:t>
+              <w:t>19.5%</w:t>
             </w:r>
           </w:p>
         </w:tc>
@@ -6895,7 +7021,7 @@
               <w:rPr>
                 <w:sz w:val="18"/>
               </w:rPr>
-              <w:t>+ Infused Vodka only</w:t>
+              <w:t>+ Infused Vodka only*</w:t>
             </w:r>
           </w:p>
         </w:tc>
@@ -6908,7 +7034,7 @@
               <w:rPr>
                 <w:sz w:val="18"/>
               </w:rPr>
-              <w:t>$2.10</w:t>
+              <w:t>$2.58</w:t>
             </w:r>
           </w:p>
         </w:tc>
@@ -6921,7 +7047,7 @@
               <w:rPr>
                 <w:sz w:val="18"/>
               </w:rPr>
-              <w:t>$17</w:t>
+              <w:t>$16</w:t>
             </w:r>
           </w:p>
         </w:tc>
@@ -6934,7 +7060,7 @@
               <w:rPr>
                 <w:sz w:val="18"/>
               </w:rPr>
-              <w:t>12.4%</w:t>
+              <w:t>16.1%</w:t>
             </w:r>
           </w:p>
         </w:tc>
@@ -6947,7 +7073,7 @@
               <w:rPr>
                 <w:sz w:val="18"/>
               </w:rPr>
-              <w:t>+$1.90 / drink</w:t>
+              <w:t>+$1.35 / drink</w:t>
             </w:r>
           </w:p>
         </w:tc>
@@ -6977,7 +7103,7 @@
               <w:rPr>
                 <w:sz w:val="18"/>
               </w:rPr>
-              <w:t>$2.45</w:t>
+              <w:t>$2.86</w:t>
             </w:r>
           </w:p>
         </w:tc>
@@ -7005,7 +7131,7 @@
               <w:rPr>
                 <w:sz w:val="18"/>
               </w:rPr>
-              <w:t>13.6%</w:t>
+              <w:t>15.9%</w:t>
             </w:r>
           </w:p>
         </w:tc>
@@ -7019,7 +7145,7 @@
               <w:rPr>
                 <w:sz w:val="18"/>
               </w:rPr>
-              <w:t>+$2.55 / drink</w:t>
+              <w:t>+$3.07 / drink</w:t>
             </w:r>
           </w:p>
         </w:tc>
@@ -7047,7 +7173,7 @@
               <w:rPr>
                 <w:sz w:val="18"/>
               </w:rPr>
-              <w:t>$2.52</w:t>
+              <w:t>$3.13</w:t>
             </w:r>
           </w:p>
         </w:tc>
@@ -7073,7 +7199,7 @@
               <w:rPr>
                 <w:sz w:val="18"/>
               </w:rPr>
-              <w:t>13.3%</w:t>
+              <w:t>16.5%</w:t>
             </w:r>
           </w:p>
         </w:tc>
@@ -7086,7 +7212,7 @@
               <w:rPr>
                 <w:sz w:val="18"/>
               </w:rPr>
-              <w:t>+$3.58 / drink</w:t>
+              <w:t>+$3.80 / drink</w:t>
             </w:r>
           </w:p>
         </w:tc>
@@ -7096,6 +7222,19 @@
       <w:pPr>
         <w:spacing w:after="80"/>
       </w:pPr>
+    </w:p>
+    <w:p>
+      <w:pPr>
+        <w:spacing w:before="40" w:after="80"/>
+      </w:pPr>
+      <w:r>
+        <w:rPr>
+          <w:b w:val="0"/>
+          <w:i/>
+          <w:sz w:val="20"/>
+        </w:rPr>
+        <w:t>* Infused vodka uses lemon juice squeezed from the infusion peels — byproduct cost near zero — replacing fresh lime.</w:t>
+      </w:r>
     </w:p>
     <w:tbl>
       <w:tblPr>
@@ -7127,7 +7266,7 @@
               <w:rPr>
                 <w:sz w:val="20"/>
               </w:rPr>
-              <w:t>Cost increase: $0.42. Price increase: $4.00. Additional profit per drink: $3.58. Pour cost improved from 14% to 13.3%. Every modification contributed to the guest experience — aroma, visual, flavour depth. None of them were decoration. That is cocktail engineering.</w:t>
+              <w:t>Cost increase: $0.20. Price increase: $4.00. Additional profit per drink: $3.80. Pour cost improved from 19.5% to 16.5%. Every modification contributed to the guest experience — aroma, visual, flavour depth. None of them were decoration. That is cocktail engineering.</w:t>
             </w:r>
           </w:p>
         </w:tc>
@@ -7444,7 +7583,7 @@
         <w:rPr>
           <w:sz w:val="20"/>
         </w:rPr>
-        <w:t>5.  The Elevated Cosmopolitan costs $0.42 more to make than the Classic and sells for $4.00 more. What is the additional profit per drink?</w:t>
+        <w:t>5.  The Elevated Cosmopolitan costs $0.20 more to make than the Classic and sells for $4.00 more. What is the additional profit per drink?</w:t>
       </w:r>
     </w:p>
     <w:p>

</xml_diff>